<commit_message>
Session 6.1 : échéances payées en partie, avertissement sur les avances, aide au balisage
- Échéances : une seule règle (repartirEcheances) pour l'écran, le PDF, les avis, les relances et le
  tableau de bord ; statuts Payé / Partiellement payé / Non payé ; echeances[].paye et .restant
  ajoutés au dictionnaire (D29, H82 à H84).
- H73 (option a) : avertissement « Provient de la facture annulée FAC-…, en attente de sa facture de
  remplacement » sur les écrans d'imputation et de restitution de l'avance.
- Aide au balisage : generateur/scripts/verifier_modele.py (pont vers les contrôles et le dictionnaire
  de l'application), docs/guide-balisage.md (méthode, pièges, anomalies A1 à A20). Aucun modèle réel.
- Compte rendu : docs/compte-rendu-phase-6.1.md.

Co-Authored-By: Claude Sonnet 5.5 <noreply@anthropic.com>
Claude-Session: https://claude.ai/code/session_01EW7nE837pEKgzt6htBQA4q
</commit_message>
<xml_diff>
--- a/generateur/tests/fixtures/facture_test.docx
+++ b/generateur/tests/fixtures/facture_test.docx
@@ -434,6 +434,11 @@
     </w:p>
     <w:p>
       <w:r>
+        <w:t>Détail de l'échéance {{ e.numero }} : payé {{ e.paye | montant }} F CFA, restant {{ e.restant | montant }} F CFA</w:t>
+      </w:r>
+    </w:p>
+    <w:p>
+      <w:r>
         <w:t>{%p endfor %}</w:t>
       </w:r>
     </w:p>

</xml_diff>